<commit_message>
modelo do contrato: parágrafos de êxito só quando há êxito
Co-Authored-By: Claude Fable 5.1 <noreply@anthropic.com>
Claude-Session: https://claude.ai/code/session_01KKVnz18k6Q6h2PumYNhv3i
</commit_message>
<xml_diff>
--- a/docs/modelos/contrato_gp.docx
+++ b/docs/modelos/contrato_gp.docx
@@ -1323,6 +1323,26 @@
       <w:r>
         <w:rPr>
           <w:rFonts w:ascii="Palatino Linotype" w:hAnsi="Palatino Linotype" w:cs="Times New Roman"/>
+        </w:rPr>
+        <w:t xml:space="preserve">{#exito}</w:t>
+      </w:r>
+    </w:p>
+    <w:p>
+      <w:pPr>
+        <w:pStyle w:val="PargrafodaLista"/>
+        <w:tabs>
+          <w:tab w:val="left" w:pos="0"/>
+        </w:tabs>
+        <w:spacing w:after="0" w:line="240" w:lineRule="auto"/>
+        <w:ind w:left="0"/>
+        <w:jc w:val="both"/>
+        <w:rPr>
+          <w:rFonts w:ascii="Palatino Linotype" w:hAnsi="Palatino Linotype" w:cs="Times New Roman"/>
+        </w:rPr>
+      </w:pPr>
+      <w:r>
+        <w:rPr>
+          <w:rFonts w:ascii="Palatino Linotype" w:hAnsi="Palatino Linotype" w:cs="Times New Roman"/>
           <w:b/>
         </w:rPr>
         <w:t xml:space="preserve">Parágrafo Segundo: </w:t>
@@ -1414,6 +1434,26 @@
           <w:rFonts w:ascii="Palatino Linotype" w:hAnsi="Palatino Linotype" w:cs="Times New Roman"/>
         </w:rPr>
         <w:t>Após a obtenção do acordo, no prazo de 48h da assinatura, as partes irão firmar aditivo ao presente contrato, incluindo as formas de pagamento dos honorários de êxito pactuadas.</w:t>
+      </w:r>
+    </w:p>
+    <w:p>
+      <w:pPr>
+        <w:pStyle w:val="PargrafodaLista"/>
+        <w:tabs>
+          <w:tab w:val="left" w:pos="0"/>
+        </w:tabs>
+        <w:spacing w:after="0" w:line="240" w:lineRule="auto"/>
+        <w:ind w:left="0"/>
+        <w:jc w:val="both"/>
+        <w:rPr>
+          <w:rFonts w:ascii="Palatino Linotype" w:hAnsi="Palatino Linotype" w:cs="Times New Roman"/>
+        </w:rPr>
+      </w:pPr>
+      <w:r>
+        <w:rPr>
+          <w:rFonts w:ascii="Palatino Linotype" w:hAnsi="Palatino Linotype" w:cs="Times New Roman"/>
+        </w:rPr>
+        <w:t xml:space="preserve">{/exito}</w:t>
       </w:r>
     </w:p>
     <w:p>

</xml_diff>